<commit_message>
More documents manually fetched
</commit_message>
<xml_diff>
--- a/output_manual/documents/pn_cst_250_19710315.docx
+++ b/output_manual/documents/pn_cst_250_19710315.docx
@@ -23,6 +23,9 @@
     <w:p>
       <w:pPr>
         <w:spacing w:line="240" w:lineRule="auto"/>
+        <w:rPr>
+          <w:lang w:val="pt-BR"/>
+        </w:rPr>
       </w:pPr>
     </w:p>
     <w:p>
@@ -36,7 +39,19 @@
         <w:rPr>
           <w:lang w:val="pt-BR"/>
         </w:rPr>
-        <w:t>Publicado no DOU em 6 mai 1971</w:t>
+        <w:t>Publicado no DOU em 6 mai</w:t>
+      </w:r>
+      <w:r>
+        <w:rPr>
+          <w:lang w:val="pt-BR"/>
+        </w:rPr>
+        <w:t>o</w:t>
+      </w:r>
+      <w:r>
+        <w:rPr>
+          <w:lang w:val="pt-BR"/>
+        </w:rPr>
+        <w:t xml:space="preserve"> 1971</w:t>
       </w:r>
     </w:p>
     <w:p>
@@ -54,16 +69,24 @@
           <w:iCs/>
           <w:lang w:val="pt-BR"/>
         </w:rPr>
-        <w:t xml:space="preserve">A concessão de isenção do Imposto de Renda, nas hipóteses do artigo 3º, do Decreto-Lei nº 484, de 03.03.1969, deve ser informada por comprovação de existência e vigência da Lei estrangeira concessiva de reciprocidade na forma do artigo 14 do Decreto-Lei nº 4.657, de 04.09.1942 (Lei de Introdução ao Código Civil Brasileiro), sempre que não haja acordo internacional excludente da </w:t>
-      </w:r>
-      <w:proofErr w:type="gramStart"/>
+        <w:t>A concessão de isenção do Imposto de Renda, nas hipóteses do artigo 3º, do Decreto-Lei nº 484, de 03.03.1969, deve ser informada por comprovação de existência e vigência da Lei estrangeira concessiva de reciprocidade na forma do artigo 14 do Decreto-Lei nº 4.657, de 04.09.1942 (Lei de Introdução ao Código Civil Brasileiro), sempre que não haja acordo internacional excludente da bitributação.</w:t>
+      </w:r>
       <w:r>
         <w:rPr>
           <w:i/>
           <w:iCs/>
           <w:lang w:val="pt-BR"/>
         </w:rPr>
-        <w:t>bitributação.De</w:t>
+        <w:t xml:space="preserve"> </w:t>
+      </w:r>
+      <w:proofErr w:type="gramStart"/>
+      <w:r>
+        <w:rPr>
+          <w:i/>
+          <w:iCs/>
+          <w:lang w:val="pt-BR"/>
+        </w:rPr>
+        <w:t>De</w:t>
       </w:r>
       <w:proofErr w:type="gramEnd"/>
       <w:r>
@@ -78,6 +101,9 @@
     <w:p>
       <w:pPr>
         <w:spacing w:line="240" w:lineRule="auto"/>
+        <w:rPr>
+          <w:lang w:val="pt-BR"/>
+        </w:rPr>
       </w:pPr>
     </w:p>
     <w:p>
@@ -864,6 +890,7 @@
   <w:style w:type="character" w:default="1" w:styleId="DefaultParagraphFont">
     <w:name w:val="Default Paragraph Font"/>
     <w:uiPriority w:val="1"/>
+    <w:semiHidden/>
     <w:unhideWhenUsed/>
   </w:style>
   <w:style w:type="table" w:default="1" w:styleId="TableNormal">

</xml_diff>